<commit_message>
DOC: Cambio de referencias
</commit_message>
<xml_diff>
--- a/Construccion de Ponencia - Grupo 3.docx
+++ b/Construccion de Ponencia - Grupo 3.docx
@@ -19,7 +19,16 @@
           <w:szCs w:val="24"/>
           <w:lang w:val="es-EC"/>
         </w:rPr>
-        <w:t xml:space="preserve">"Aplicación móvil con geolocalización para mejorar el servicio de asistencia técnica especializada para los habitantes de la ciudad de Quito, 2026." </w:t>
+        <w:t>Aplicación móvil con geolocalización para mejorar el servicio de asistencia técnica especializada para los habitante</w:t>
+      </w:r>
+      <w:r>
+        <w:rPr>
+          <w:rFonts w:ascii="Times New Roman" w:hAnsi="Times New Roman" w:cs="Times New Roman"/>
+          <w:sz w:val="24"/>
+          <w:szCs w:val="24"/>
+          <w:lang w:val="es-EC"/>
+        </w:rPr>
+        <w:t>s de la ciudad de Quito, 2026.</w:t>
       </w:r>
     </w:p>
     <w:p>
@@ -50,7 +59,7 @@
           <w:szCs w:val="24"/>
           <w:lang w:val="es-EC"/>
         </w:rPr>
-        <w:t xml:space="preserve">"Mobile </w:t>
+        <w:t xml:space="preserve">Mobile </w:t>
       </w:r>
       <w:proofErr w:type="spellStart"/>
       <w:r>
@@ -270,8 +279,10 @@
           <w:szCs w:val="24"/>
           <w:lang w:val="es-EC"/>
         </w:rPr>
-        <w:t xml:space="preserve"> of Quito, 2026." </w:t>
-      </w:r>
+        <w:t xml:space="preserve"> of Quito, 2026.</w:t>
+      </w:r>
+      <w:bookmarkStart w:id="0" w:name="_GoBack"/>
+      <w:bookmarkEnd w:id="0"/>
     </w:p>
     <w:p>
       <w:pPr>
@@ -975,6 +986,7 @@
           <w:id w:val="-1963252691"/>
           <w:citation/>
         </w:sdtPr>
+        <w:sdtEndPr/>
         <w:sdtContent>
           <w:r>
             <w:rPr>
@@ -1080,6 +1092,7 @@
           <w:id w:val="678007925"/>
           <w:citation/>
         </w:sdtPr>
+        <w:sdtEndPr/>
         <w:sdtContent>
           <w:r>
             <w:rPr>
@@ -1186,6 +1199,7 @@
           <w:id w:val="655724713"/>
           <w:citation/>
         </w:sdtPr>
+        <w:sdtEndPr/>
         <w:sdtContent>
           <w:r>
             <w:rPr>
@@ -1286,6 +1300,7 @@
           <w:id w:val="-799530090"/>
           <w:citation/>
         </w:sdtPr>
+        <w:sdtEndPr/>
         <w:sdtContent>
           <w:r>
             <w:rPr>
@@ -1375,6 +1390,7 @@
           <w:id w:val="-974439473"/>
           <w:citation/>
         </w:sdtPr>
+        <w:sdtEndPr/>
         <w:sdtContent>
           <w:r>
             <w:rPr>
@@ -1463,6 +1479,7 @@
           <w:id w:val="-888256776"/>
           <w:citation/>
         </w:sdtPr>
+        <w:sdtEndPr/>
         <w:sdtContent>
           <w:r>
             <w:rPr>
@@ -1639,6 +1656,7 @@
           <w:id w:val="1354144116"/>
           <w:citation/>
         </w:sdtPr>
+        <w:sdtEndPr/>
         <w:sdtContent>
           <w:r>
             <w:rPr>
@@ -1748,6 +1766,7 @@
           <w:id w:val="1548720531"/>
           <w:citation/>
         </w:sdtPr>
+        <w:sdtEndPr/>
         <w:sdtContent>
           <w:r>
             <w:rPr>
@@ -1876,6 +1895,7 @@
           <w:id w:val="355316933"/>
           <w:citation/>
         </w:sdtPr>
+        <w:sdtEndPr/>
         <w:sdtContent>
           <w:r>
             <w:rPr>
@@ -2016,6 +2036,7 @@
           <w:id w:val="1720715328"/>
           <w:citation/>
         </w:sdtPr>
+        <w:sdtEndPr/>
         <w:sdtContent>
           <w:r>
             <w:rPr>
@@ -2124,6 +2145,7 @@
           <w:id w:val="186336644"/>
           <w:citation/>
         </w:sdtPr>
+        <w:sdtEndPr/>
         <w:sdtContent>
           <w:r>
             <w:rPr>
@@ -2324,6 +2346,7 @@
           <w:id w:val="-117301167"/>
           <w:citation/>
         </w:sdtPr>
+        <w:sdtEndPr/>
         <w:sdtContent>
           <w:r>
             <w:rPr>
@@ -2464,6 +2487,7 @@
           <w:id w:val="-1623924238"/>
           <w:citation/>
         </w:sdtPr>
+        <w:sdtEndPr/>
         <w:sdtContent>
           <w:r>
             <w:rPr>
@@ -2543,6 +2567,7 @@
           <w:id w:val="-1511445695"/>
           <w:citation/>
         </w:sdtPr>
+        <w:sdtEndPr/>
         <w:sdtContent>
           <w:r>
             <w:rPr>
@@ -2630,7 +2655,7 @@
           <w:szCs w:val="24"/>
           <w:lang w:val="es-EC"/>
         </w:rPr>
-        <w:t xml:space="preserve">La digitalización y la economía colaborativa impulsan las plataformas de servicios bajo demanda: se proyecta un mercado de USD 674,1 mil millones en 2026, con una penetración de </w:t>
+        <w:t xml:space="preserve">La digitalización impulsa el crecimiento del mercado global de la economía </w:t>
       </w:r>
       <w:proofErr w:type="spellStart"/>
       <w:r>
@@ -2640,7 +2665,7 @@
           <w:szCs w:val="24"/>
           <w:lang w:val="es-EC"/>
         </w:rPr>
-        <w:t>smartphones</w:t>
+        <w:t>gig</w:t>
       </w:r>
       <w:proofErr w:type="spellEnd"/>
       <w:r>
@@ -2650,7 +2675,253 @@
           <w:szCs w:val="24"/>
           <w:lang w:val="es-EC"/>
         </w:rPr>
-        <w:t xml:space="preserve"> que supera el 80 % de la población (6 500 millones de usuarios) en 2025. El mercado global de asistencia alcanzó USD 40,9 mil millones en 2025, y plataformas como </w:t>
+        <w:t xml:space="preserve">, valorado en USD 674,13 mil millones para 2026 </w:t>
+      </w:r>
+      <w:sdt>
+        <w:sdtPr>
+          <w:rPr>
+            <w:rFonts w:ascii="Times New Roman" w:hAnsi="Times New Roman" w:cs="Times New Roman"/>
+            <w:sz w:val="24"/>
+            <w:szCs w:val="24"/>
+            <w:lang w:val="es-EC"/>
+          </w:rPr>
+          <w:id w:val="1516266789"/>
+          <w:citation/>
+        </w:sdtPr>
+        <w:sdtEndPr/>
+        <w:sdtContent>
+          <w:r>
+            <w:rPr>
+              <w:rFonts w:ascii="Times New Roman" w:hAnsi="Times New Roman" w:cs="Times New Roman"/>
+              <w:sz w:val="24"/>
+              <w:szCs w:val="24"/>
+              <w:lang w:val="es-EC"/>
+            </w:rPr>
+            <w:fldChar w:fldCharType="begin"/>
+          </w:r>
+          <w:r>
+            <w:rPr>
+              <w:rFonts w:ascii="Times New Roman" w:hAnsi="Times New Roman" w:cs="Times New Roman"/>
+              <w:sz w:val="24"/>
+              <w:szCs w:val="24"/>
+              <w:lang w:val="es-ES"/>
+            </w:rPr>
+            <w:instrText xml:space="preserve"> CITATION Bus26 \l 3082 </w:instrText>
+          </w:r>
+          <w:r>
+            <w:rPr>
+              <w:rFonts w:ascii="Times New Roman" w:hAnsi="Times New Roman" w:cs="Times New Roman"/>
+              <w:sz w:val="24"/>
+              <w:szCs w:val="24"/>
+              <w:lang w:val="es-EC"/>
+            </w:rPr>
+            <w:fldChar w:fldCharType="separate"/>
+          </w:r>
+          <w:r>
+            <w:rPr>
+              <w:rFonts w:ascii="Times New Roman" w:hAnsi="Times New Roman" w:cs="Times New Roman"/>
+              <w:noProof/>
+              <w:sz w:val="24"/>
+              <w:szCs w:val="24"/>
+              <w:lang w:val="es-ES"/>
+            </w:rPr>
+            <w:t>(Business Research Insights, 2026)</w:t>
+          </w:r>
+          <w:r>
+            <w:rPr>
+              <w:rFonts w:ascii="Times New Roman" w:hAnsi="Times New Roman" w:cs="Times New Roman"/>
+              <w:sz w:val="24"/>
+              <w:szCs w:val="24"/>
+              <w:lang w:val="es-EC"/>
+            </w:rPr>
+            <w:fldChar w:fldCharType="end"/>
+          </w:r>
+        </w:sdtContent>
+      </w:sdt>
+      <w:r>
+        <w:rPr>
+          <w:rFonts w:ascii="Times New Roman" w:hAnsi="Times New Roman" w:cs="Times New Roman"/>
+          <w:sz w:val="24"/>
+          <w:szCs w:val="24"/>
+          <w:lang w:val="es-EC"/>
+        </w:rPr>
+        <w:t xml:space="preserve">. El acceso móvil también se expande: 4 700 millones de personas, el 58 % de la población mundial, ya usan Internet móvil desde su propio dispositivo </w:t>
+      </w:r>
+      <w:sdt>
+        <w:sdtPr>
+          <w:rPr>
+            <w:rFonts w:ascii="Times New Roman" w:hAnsi="Times New Roman" w:cs="Times New Roman"/>
+            <w:sz w:val="24"/>
+            <w:szCs w:val="24"/>
+            <w:lang w:val="es-EC"/>
+          </w:rPr>
+          <w:id w:val="-830519024"/>
+          <w:citation/>
+        </w:sdtPr>
+        <w:sdtEndPr/>
+        <w:sdtContent>
+          <w:r>
+            <w:rPr>
+              <w:rFonts w:ascii="Times New Roman" w:hAnsi="Times New Roman" w:cs="Times New Roman"/>
+              <w:sz w:val="24"/>
+              <w:szCs w:val="24"/>
+              <w:lang w:val="es-EC"/>
+            </w:rPr>
+            <w:fldChar w:fldCharType="begin"/>
+          </w:r>
+          <w:r>
+            <w:rPr>
+              <w:rFonts w:ascii="Times New Roman" w:hAnsi="Times New Roman" w:cs="Times New Roman"/>
+              <w:sz w:val="24"/>
+              <w:szCs w:val="24"/>
+              <w:lang w:val="es-ES"/>
+            </w:rPr>
+            <w:instrText xml:space="preserve">CITATION GSM26 \l 3082 </w:instrText>
+          </w:r>
+          <w:r>
+            <w:rPr>
+              <w:rFonts w:ascii="Times New Roman" w:hAnsi="Times New Roman" w:cs="Times New Roman"/>
+              <w:sz w:val="24"/>
+              <w:szCs w:val="24"/>
+              <w:lang w:val="es-EC"/>
+            </w:rPr>
+            <w:fldChar w:fldCharType="separate"/>
+          </w:r>
+          <w:r>
+            <w:rPr>
+              <w:rFonts w:ascii="Times New Roman" w:hAnsi="Times New Roman" w:cs="Times New Roman"/>
+              <w:noProof/>
+              <w:sz w:val="24"/>
+              <w:szCs w:val="24"/>
+              <w:lang w:val="es-ES"/>
+            </w:rPr>
+            <w:t>(GSMA, 2026)</w:t>
+          </w:r>
+          <w:r>
+            <w:rPr>
+              <w:rFonts w:ascii="Times New Roman" w:hAnsi="Times New Roman" w:cs="Times New Roman"/>
+              <w:sz w:val="24"/>
+              <w:szCs w:val="24"/>
+              <w:lang w:val="es-EC"/>
+            </w:rPr>
+            <w:fldChar w:fldCharType="end"/>
+          </w:r>
+        </w:sdtContent>
+      </w:sdt>
+      <w:r>
+        <w:rPr>
+          <w:rFonts w:ascii="Times New Roman" w:hAnsi="Times New Roman" w:cs="Times New Roman"/>
+          <w:sz w:val="24"/>
+          <w:szCs w:val="24"/>
+          <w:lang w:val="es-EC"/>
+        </w:rPr>
+        <w:t xml:space="preserve">. El mercado </w:t>
+      </w:r>
+      <w:r>
+        <w:rPr>
+          <w:rFonts w:ascii="Times New Roman" w:hAnsi="Times New Roman" w:cs="Times New Roman"/>
+          <w:sz w:val="24"/>
+          <w:szCs w:val="24"/>
+          <w:lang w:val="es-EC"/>
+        </w:rPr>
+        <w:t xml:space="preserve">global </w:t>
+      </w:r>
+      <w:r>
+        <w:rPr>
+          <w:rFonts w:ascii="Times New Roman" w:hAnsi="Times New Roman" w:cs="Times New Roman"/>
+          <w:sz w:val="24"/>
+          <w:szCs w:val="24"/>
+          <w:lang w:val="es-EC"/>
+        </w:rPr>
+        <w:t xml:space="preserve">de servicios bajo demanda para el hogar se proyecta </w:t>
+      </w:r>
+      <w:r>
+        <w:rPr>
+          <w:rFonts w:ascii="Times New Roman" w:hAnsi="Times New Roman" w:cs="Times New Roman"/>
+          <w:sz w:val="24"/>
+          <w:szCs w:val="24"/>
+          <w:lang w:val="es-EC"/>
+        </w:rPr>
+        <w:t xml:space="preserve">que crecerá </w:t>
+      </w:r>
+      <w:r>
+        <w:rPr>
+          <w:rFonts w:ascii="Times New Roman" w:hAnsi="Times New Roman" w:cs="Times New Roman"/>
+          <w:sz w:val="24"/>
+          <w:szCs w:val="24"/>
+          <w:lang w:val="es-EC"/>
+        </w:rPr>
+        <w:t xml:space="preserve">entre USD 5 920 y 6 790 millones para el periodo 2025-2026 </w:t>
+      </w:r>
+      <w:sdt>
+        <w:sdtPr>
+          <w:rPr>
+            <w:rFonts w:ascii="Times New Roman" w:hAnsi="Times New Roman" w:cs="Times New Roman"/>
+            <w:sz w:val="24"/>
+            <w:szCs w:val="24"/>
+            <w:lang w:val="es-EC"/>
+          </w:rPr>
+          <w:id w:val="987206761"/>
+          <w:citation/>
+        </w:sdtPr>
+        <w:sdtEndPr/>
+        <w:sdtContent>
+          <w:r>
+            <w:rPr>
+              <w:rFonts w:ascii="Times New Roman" w:hAnsi="Times New Roman" w:cs="Times New Roman"/>
+              <w:sz w:val="24"/>
+              <w:szCs w:val="24"/>
+              <w:lang w:val="es-EC"/>
+            </w:rPr>
+            <w:fldChar w:fldCharType="begin"/>
+          </w:r>
+          <w:r>
+            <w:rPr>
+              <w:rFonts w:ascii="Times New Roman" w:hAnsi="Times New Roman" w:cs="Times New Roman"/>
+              <w:sz w:val="24"/>
+              <w:szCs w:val="24"/>
+              <w:lang w:val="es-ES"/>
+            </w:rPr>
+            <w:instrText xml:space="preserve"> CITATION The26 \l 3082 </w:instrText>
+          </w:r>
+          <w:r>
+            <w:rPr>
+              <w:rFonts w:ascii="Times New Roman" w:hAnsi="Times New Roman" w:cs="Times New Roman"/>
+              <w:sz w:val="24"/>
+              <w:szCs w:val="24"/>
+              <w:lang w:val="es-EC"/>
+            </w:rPr>
+            <w:fldChar w:fldCharType="separate"/>
+          </w:r>
+          <w:r>
+            <w:rPr>
+              <w:rFonts w:ascii="Times New Roman" w:hAnsi="Times New Roman" w:cs="Times New Roman"/>
+              <w:noProof/>
+              <w:sz w:val="24"/>
+              <w:szCs w:val="24"/>
+              <w:lang w:val="es-ES"/>
+            </w:rPr>
+            <w:t>(The Business Research Company, 2026)</w:t>
+          </w:r>
+          <w:r>
+            <w:rPr>
+              <w:rFonts w:ascii="Times New Roman" w:hAnsi="Times New Roman" w:cs="Times New Roman"/>
+              <w:sz w:val="24"/>
+              <w:szCs w:val="24"/>
+              <w:lang w:val="es-EC"/>
+            </w:rPr>
+            <w:fldChar w:fldCharType="end"/>
+          </w:r>
+        </w:sdtContent>
+      </w:sdt>
+      <w:r>
+        <w:rPr>
+          <w:rFonts w:ascii="Times New Roman" w:hAnsi="Times New Roman" w:cs="Times New Roman"/>
+          <w:sz w:val="24"/>
+          <w:szCs w:val="24"/>
+          <w:lang w:val="es-EC"/>
+        </w:rPr>
+        <w:t xml:space="preserve">,  plataformas como </w:t>
       </w:r>
       <w:proofErr w:type="spellStart"/>
       <w:r>
@@ -2670,20 +2941,97 @@
           <w:szCs w:val="24"/>
           <w:lang w:val="es-EC"/>
         </w:rPr>
-        <w:t xml:space="preserve"> Company más de 10 millones de usuarios en 2023 confirman el potencial de la geolocalización y los sistemas de reputación para conectar usuarios y prestadores de forma rápida y confiable (fuente por verificar).</w:t>
-      </w:r>
-    </w:p>
-    <w:p>
-      <w:pPr>
-        <w:spacing w:before="240" w:after="240" w:line="480" w:lineRule="auto"/>
-        <w:ind w:firstLine="720"/>
-        <w:rPr>
-          <w:rFonts w:ascii="Times New Roman" w:hAnsi="Times New Roman" w:cs="Times New Roman"/>
-          <w:sz w:val="24"/>
-          <w:szCs w:val="24"/>
-          <w:lang w:val="es-EC"/>
-        </w:rPr>
-      </w:pPr>
+        <w:t xml:space="preserve"> Company, </w:t>
+      </w:r>
+      <w:r>
+        <w:rPr>
+          <w:rFonts w:ascii="Times New Roman" w:hAnsi="Times New Roman" w:cs="Times New Roman"/>
+          <w:sz w:val="24"/>
+          <w:szCs w:val="24"/>
+          <w:lang w:val="es-EC"/>
+        </w:rPr>
+        <w:t>que a marzo de 2025 integraban alrededor de 40 000 profesionales registrados</w:t>
+      </w:r>
+      <w:sdt>
+        <w:sdtPr>
+          <w:rPr>
+            <w:rFonts w:ascii="Times New Roman" w:hAnsi="Times New Roman" w:cs="Times New Roman"/>
+            <w:sz w:val="24"/>
+            <w:szCs w:val="24"/>
+            <w:lang w:val="es-EC"/>
+          </w:rPr>
+          <w:id w:val="357167216"/>
+          <w:citation/>
+        </w:sdtPr>
+        <w:sdtEndPr/>
+        <w:sdtContent>
+          <w:r>
+            <w:rPr>
+              <w:rFonts w:ascii="Times New Roman" w:hAnsi="Times New Roman" w:cs="Times New Roman"/>
+              <w:sz w:val="24"/>
+              <w:szCs w:val="24"/>
+              <w:lang w:val="es-EC"/>
+            </w:rPr>
+            <w:fldChar w:fldCharType="begin"/>
+          </w:r>
+          <w:r>
+            <w:rPr>
+              <w:rFonts w:ascii="Times New Roman" w:hAnsi="Times New Roman" w:cs="Times New Roman"/>
+              <w:sz w:val="24"/>
+              <w:szCs w:val="24"/>
+              <w:lang w:val="es-ES"/>
+            </w:rPr>
+            <w:instrText xml:space="preserve"> CITATION Urb24 \l 3082 </w:instrText>
+          </w:r>
+          <w:r>
+            <w:rPr>
+              <w:rFonts w:ascii="Times New Roman" w:hAnsi="Times New Roman" w:cs="Times New Roman"/>
+              <w:sz w:val="24"/>
+              <w:szCs w:val="24"/>
+              <w:lang w:val="es-EC"/>
+            </w:rPr>
+            <w:fldChar w:fldCharType="separate"/>
+          </w:r>
+          <w:r>
+            <w:rPr>
+              <w:rFonts w:ascii="Times New Roman" w:hAnsi="Times New Roman" w:cs="Times New Roman"/>
+              <w:noProof/>
+              <w:sz w:val="24"/>
+              <w:szCs w:val="24"/>
+              <w:lang w:val="es-ES"/>
+            </w:rPr>
+            <w:t xml:space="preserve"> </w:t>
+          </w:r>
+          <w:r>
+            <w:rPr>
+              <w:rFonts w:ascii="Times New Roman" w:hAnsi="Times New Roman" w:cs="Times New Roman"/>
+              <w:noProof/>
+              <w:sz w:val="24"/>
+              <w:szCs w:val="24"/>
+              <w:lang w:val="es-ES"/>
+            </w:rPr>
+            <w:t>(Urban Company, 2024)</w:t>
+          </w:r>
+          <w:r>
+            <w:rPr>
+              <w:rFonts w:ascii="Times New Roman" w:hAnsi="Times New Roman" w:cs="Times New Roman"/>
+              <w:sz w:val="24"/>
+              <w:szCs w:val="24"/>
+              <w:lang w:val="es-EC"/>
+            </w:rPr>
+            <w:fldChar w:fldCharType="end"/>
+          </w:r>
+        </w:sdtContent>
+      </w:sdt>
+      <w:r>
+        <w:rPr>
+          <w:rFonts w:ascii="Times New Roman" w:hAnsi="Times New Roman" w:cs="Times New Roman"/>
+          <w:sz w:val="24"/>
+          <w:szCs w:val="24"/>
+          <w:lang w:val="es-EC"/>
+        </w:rPr>
+        <w:t>, confirman el potencial de la geolocalización y los sistemas de reputación para conectar usuarios y prestadores de forma rápida y confiable.</w:t>
+      </w:r>
     </w:p>
     <w:p>
       <w:pPr>
@@ -2717,6 +3065,7 @@
           <w:id w:val="-825740430"/>
           <w:citation/>
         </w:sdtPr>
+        <w:sdtEndPr/>
         <w:sdtContent>
           <w:r>
             <w:rPr>
@@ -2805,6 +3154,7 @@
           <w:id w:val="1064453489"/>
           <w:citation/>
         </w:sdtPr>
+        <w:sdtEndPr/>
         <w:sdtContent>
           <w:r>
             <w:rPr>
@@ -2884,6 +3234,7 @@
           <w:id w:val="1992753370"/>
           <w:citation/>
         </w:sdtPr>
+        <w:sdtEndPr/>
         <w:sdtContent>
           <w:r>
             <w:rPr>
@@ -2984,6 +3335,7 @@
           <w:id w:val="-1577352200"/>
           <w:citation/>
         </w:sdtPr>
+        <w:sdtEndPr/>
         <w:sdtContent>
           <w:r>
             <w:rPr>
@@ -3068,16 +3420,7 @@
           <w:szCs w:val="24"/>
           <w:lang w:val="es-EC"/>
         </w:rPr>
-        <w:t>ersiste un sector de trabajadores independientes y actividades económicas informales relacionadas con servicios técnicos</w:t>
-      </w:r>
-      <w:r>
-        <w:rPr>
-          <w:rFonts w:ascii="Times New Roman" w:hAnsi="Times New Roman" w:cs="Times New Roman"/>
-          <w:sz w:val="24"/>
-          <w:szCs w:val="24"/>
-          <w:lang w:val="es-EC"/>
-        </w:rPr>
-        <w:t xml:space="preserve">, la ausencia de un directorio </w:t>
+        <w:t xml:space="preserve">ersiste un sector de trabajadores independientes y actividades económicas informales relacionadas con servicios técnicos, la ausencia de un directorio </w:t>
       </w:r>
       <w:proofErr w:type="spellStart"/>
       <w:r>
@@ -3110,6 +3453,7 @@
           <w:id w:val="-1468886518"/>
           <w:citation/>
         </w:sdtPr>
+        <w:sdtEndPr/>
         <w:sdtContent>
           <w:r>
             <w:rPr>
@@ -3198,6 +3542,7 @@
           <w:id w:val="-1803299586"/>
           <w:citation/>
         </w:sdtPr>
+        <w:sdtEndPr/>
         <w:sdtContent>
           <w:r>
             <w:rPr>
@@ -3384,6 +3729,7 @@
         <w:spacing w:before="240" w:after="240" w:line="480" w:lineRule="auto"/>
         <w:rPr>
           <w:rFonts w:ascii="Times New Roman" w:hAnsi="Times New Roman" w:cs="Times New Roman"/>
+          <w:i/>
           <w:sz w:val="24"/>
           <w:szCs w:val="24"/>
           <w:lang w:val="es-EC"/>
@@ -3393,6 +3739,7 @@
         <w:rPr>
           <w:rFonts w:ascii="Times New Roman" w:hAnsi="Times New Roman" w:cs="Times New Roman"/>
           <w:b/>
+          <w:i/>
           <w:sz w:val="24"/>
           <w:szCs w:val="24"/>
           <w:lang w:val="es-EC"/>
@@ -3402,6 +3749,7 @@
       <w:r>
         <w:rPr>
           <w:rFonts w:ascii="Times New Roman" w:hAnsi="Times New Roman" w:cs="Times New Roman"/>
+          <w:i/>
           <w:sz w:val="24"/>
           <w:szCs w:val="24"/>
           <w:lang w:val="es-EC"/>
@@ -3460,6 +3808,7 @@
           <w:id w:val="1201049863"/>
           <w:citation/>
         </w:sdtPr>
+        <w:sdtEndPr/>
         <w:sdtContent>
           <w:r>
             <w:rPr>
@@ -3544,6 +3893,7 @@
         <w:spacing w:before="240" w:after="240" w:line="480" w:lineRule="auto"/>
         <w:rPr>
           <w:rFonts w:ascii="Times New Roman" w:hAnsi="Times New Roman" w:cs="Times New Roman"/>
+          <w:i/>
           <w:sz w:val="24"/>
           <w:szCs w:val="24"/>
           <w:lang w:val="es-EC"/>
@@ -3553,6 +3903,7 @@
         <w:rPr>
           <w:rFonts w:ascii="Times New Roman" w:hAnsi="Times New Roman" w:cs="Times New Roman"/>
           <w:b/>
+          <w:i/>
           <w:sz w:val="24"/>
           <w:szCs w:val="24"/>
           <w:lang w:val="es-EC"/>
@@ -3562,6 +3913,7 @@
       <w:r>
         <w:rPr>
           <w:rFonts w:ascii="Times New Roman" w:hAnsi="Times New Roman" w:cs="Times New Roman"/>
+          <w:i/>
           <w:sz w:val="24"/>
           <w:szCs w:val="24"/>
           <w:lang w:val="es-EC"/>
@@ -3707,6 +4059,7 @@
         <w:rPr>
           <w:rFonts w:ascii="Times New Roman" w:hAnsi="Times New Roman" w:cs="Times New Roman"/>
           <w:b/>
+          <w:i/>
           <w:sz w:val="24"/>
           <w:szCs w:val="24"/>
           <w:lang w:val="es-EC"/>
@@ -3716,6 +4069,7 @@
         <w:rPr>
           <w:rFonts w:ascii="Times New Roman" w:hAnsi="Times New Roman" w:cs="Times New Roman"/>
           <w:b/>
+          <w:i/>
           <w:sz w:val="24"/>
           <w:szCs w:val="24"/>
           <w:lang w:val="es-EC"/>
@@ -3765,6 +4119,7 @@
           <w:id w:val="-1773466024"/>
           <w:citation/>
         </w:sdtPr>
+        <w:sdtEndPr/>
         <w:sdtContent>
           <w:r>
             <w:rPr>
@@ -3944,6 +4299,7 @@
           <w:id w:val="-758139338"/>
           <w:citation/>
         </w:sdtPr>
+        <w:sdtEndPr/>
         <w:sdtContent>
           <w:r>
             <w:rPr>
@@ -4009,6 +4365,7 @@
         <w:rPr>
           <w:rFonts w:ascii="Times New Roman" w:hAnsi="Times New Roman" w:cs="Times New Roman"/>
           <w:b/>
+          <w:i/>
           <w:sz w:val="24"/>
           <w:szCs w:val="24"/>
           <w:lang w:val="es-EC"/>
@@ -4018,6 +4375,7 @@
         <w:rPr>
           <w:rFonts w:ascii="Times New Roman" w:hAnsi="Times New Roman" w:cs="Times New Roman"/>
           <w:b/>
+          <w:i/>
           <w:sz w:val="24"/>
           <w:szCs w:val="24"/>
           <w:lang w:val="es-EC"/>
@@ -4251,8 +4609,6 @@
         </w:rPr>
         <w:t xml:space="preserve"> de mapas y servicios de geolocalización, mientras que el modelado de la arquitectura del sistema y sus procesos se realiza mediante diagramas UML.</w:t>
       </w:r>
-      <w:bookmarkStart w:id="0" w:name="_GoBack"/>
-      <w:bookmarkEnd w:id="0"/>
     </w:p>
     <w:p>
       <w:pPr>
@@ -5857,7 +6213,7 @@
     <b:Title>Geovisualizador INEC</b:Title>
     <b:Year>2022</b:Year>
     <b:URL>https://geovisualizador.inec.gob.ec/</b:URL>
-    <b:RefOrder>16</b:RefOrder>
+    <b:RefOrder>20</b:RefOrder>
   </b:Source>
   <b:Source>
     <b:Tag>INE23</b:Tag>
@@ -5873,7 +6229,7 @@
     <b:Month>diciembre</b:Month>
     <b:Day>23</b:Day>
     <b:URL>https://www.censoecuador.gob.ec/el-servicio-de-internet-fijo-crece-5-veces-mas-que-en-2010/</b:URL>
-    <b:RefOrder>14</b:RefOrder>
+    <b:RefOrder>18</b:RefOrder>
   </b:Source>
   <b:Source>
     <b:Tag>Dat26</b:Tag>
@@ -5887,7 +6243,7 @@
     <b:Title>Digital 2026: Ecuador — DataReportal – Global Digital Insights</b:Title>
     <b:Year>2026</b:Year>
     <b:URL>https://datareportal.com/reports/digital-2026-ecuador</b:URL>
-    <b:RefOrder>13</b:RefOrder>
+    <b:RefOrder>17</b:RefOrder>
   </b:Source>
   <b:Source>
     <b:Tag>INE25</b:Tag>
@@ -5902,7 +6258,7 @@
     <b:Year>2025</b:Year>
     <b:Month>agosto</b:Month>
     <b:URL>https://www.ecuadorencifras.gob.ec/documentos/web-inec/Estadisticas_Economicas/Estadistica%20de%20Transporte/ESTRA/2024/Principales_Resultados_ESTRA_2024.pdf</b:URL>
-    <b:RefOrder>15</b:RefOrder>
+    <b:RefOrder>19</b:RefOrder>
   </b:Source>
   <b:Source>
     <b:Tag>Alm25</b:Tag>
@@ -6271,7 +6627,7 @@
     <b:Year>2025</b:Year>
     <b:Month>Abril</b:Month>
     <b:URL>https://u4ssc.itu.int/wp-content/uploads/2025/04/2500529_U4SSC-Verification-Report-Quito-Ecuador.pdf</b:URL>
-    <b:RefOrder>17</b:RefOrder>
+    <b:RefOrder>21</b:RefOrder>
   </b:Source>
   <b:Source>
     <b:Tag>Mun22</b:Tag>
@@ -6286,7 +6642,7 @@
     <b:InternetSiteTitle>https://gobiernoabierto.quito.gob.ec</b:InternetSiteTitle>
     <b:Year>2022</b:Year>
     <b:URL>https://gobiernoabierto.quito.gob.ec/wp-content/uploads/2023/05/PMMS-Quito_2022_2042.pdf</b:URL>
-    <b:RefOrder>18</b:RefOrder>
+    <b:RefOrder>22</b:RefOrder>
   </b:Source>
   <b:Source>
     <b:Tag>Her18</b:Tag>
@@ -6310,7 +6666,7 @@
         </b:NameList>
       </b:Author>
     </b:Author>
-    <b:RefOrder>19</b:RefOrder>
+    <b:RefOrder>23</b:RefOrder>
   </b:Source>
   <b:Source>
     <b:Tag>Sch201</b:Tag>
@@ -6335,13 +6691,80 @@
         </b:NameList>
       </b:Author>
     </b:Author>
-    <b:RefOrder>20</b:RefOrder>
+    <b:RefOrder>24</b:RefOrder>
+  </b:Source>
+  <b:Source>
+    <b:Tag>Bus26</b:Tag>
+    <b:SourceType>InternetSite</b:SourceType>
+    <b:Guid>{BADE695F-B1ED-434D-A898-3A10B10019E0}</b:Guid>
+    <b:Author>
+      <b:Author>
+        <b:Corporate>Business Research Insights</b:Corporate>
+      </b:Author>
+    </b:Author>
+    <b:Title>Gig Economy Market Size, Share, Growth, and Industry Analysis, By Type (Asset Sharing Services, Transportation Services, Professional Services, Household and Miscellaneous Services, Others), By Application (Transportation, Accommodation, Food and Beverage</b:Title>
+    <b:InternetSiteTitle>https://www.businessresearchinsights.com</b:InternetSiteTitle>
+    <b:Year>2026</b:Year>
+    <b:Month>julio</b:Month>
+    <b:Day>13</b:Day>
+    <b:URL>https://www.businessresearchinsights.com/market-reports/gig-economy-market-102503</b:URL>
+    <b:RefOrder>13</b:RefOrder>
+  </b:Source>
+  <b:Source>
+    <b:Tag>GSM26</b:Tag>
+    <b:SourceType>DocumentFromInternetSite</b:SourceType>
+    <b:Guid>{9DC335D4-6479-432B-854E-BF4110FDA80E}</b:Guid>
+    <b:Title>The State of Mobile Internet Connectivity 2025</b:Title>
+    <b:InternetSiteTitle>https://www.gsma.com</b:InternetSiteTitle>
+    <b:Year>2026</b:Year>
+    <b:Month>agosto</b:Month>
+    <b:Day>02</b:Day>
+    <b:URL>https://www.gsma.com/somic/wp-content/uploads/2025/09/The-State-of-Mobile-Internet-Connectivity-2025-Overview-Report.pdf</b:URL>
+    <b:Author>
+      <b:Author>
+        <b:Corporate>GSMA</b:Corporate>
+      </b:Author>
+    </b:Author>
+    <b:RefOrder>14</b:RefOrder>
+  </b:Source>
+  <b:Source>
+    <b:Tag>The26</b:Tag>
+    <b:SourceType>InternetSite</b:SourceType>
+    <b:Guid>{3901B9BA-8442-4FDB-A228-A57B6191C56E}</b:Guid>
+    <b:Title>Online On-demand Home Services Market Report 2026</b:Title>
+    <b:InternetSiteTitle>https://www.thebusinessresearchcompany.com</b:InternetSiteTitle>
+    <b:Year>2026</b:Year>
+    <b:Month>julio</b:Month>
+    <b:URL>https://www.thebusinessresearchcompany.com/report/online-on-demand-home-services-global-market-report</b:URL>
+    <b:Author>
+      <b:Author>
+        <b:Corporate>The Business Research Company</b:Corporate>
+      </b:Author>
+    </b:Author>
+    <b:RefOrder>15</b:RefOrder>
+  </b:Source>
+  <b:Source>
+    <b:Tag>Urb24</b:Tag>
+    <b:SourceType>InternetSite</b:SourceType>
+    <b:Guid>{C8182A02-AE4F-49A7-882A-7714B15466FA}</b:Guid>
+    <b:Author>
+      <b:Author>
+        <b:Corporate>Urban Company</b:Corporate>
+      </b:Author>
+    </b:Author>
+    <b:Title>Urban Company - Get expert professional services at home</b:Title>
+    <b:InternetSiteTitle>https://www.urbancompany.com</b:InternetSiteTitle>
+    <b:Year>2024</b:Year>
+    <b:Month>diciembre</b:Month>
+    <b:Day>31</b:Day>
+    <b:URL>https://www.urbancompany.com/about</b:URL>
+    <b:RefOrder>16</b:RefOrder>
   </b:Source>
 </b:Sources>
 </file>
 
 <file path=customXml/itemProps1.xml><?xml version="1.0" encoding="utf-8"?>
-<ds:datastoreItem xmlns:ds="http://schemas.openxmlformats.org/officeDocument/2006/customXml" ds:itemID="{D2037CA2-3016-4A7E-85A3-8217B31545BD}">
+<ds:datastoreItem xmlns:ds="http://schemas.openxmlformats.org/officeDocument/2006/customXml" ds:itemID="{50815570-F346-46BC-AA08-03B375C552E3}">
   <ds:schemaRefs>
     <ds:schemaRef ds:uri="http://schemas.openxmlformats.org/officeDocument/2006/bibliography"/>
   </ds:schemaRefs>

</xml_diff>